<commit_message>
Shorten user personas and user stories
</commit_message>
<xml_diff>
--- a/Module 1/User Stories/User_Stories_Document.docx
+++ b/Module 1/User Stories/User_Stories_Document.docx
@@ -117,28 +117,78 @@
     </w:p>
     <w:p>
       <w:r>
+        <w:t xml:space="preserve">UST-02: </w:t>
+      </w:r>
+      <w:r>
+        <w:t xml:space="preserve">As a possible new </w:t>
+      </w:r>
+      <w:r>
+        <w:t>customer,</w:t>
+      </w:r>
+      <w:r>
+        <w:t xml:space="preserve"> I want information on the slip pricing formula, a general 10/ft + 10 </w:t>
+      </w:r>
+      <w:r>
+        <w:t>Elec</w:t>
+      </w:r>
+      <w:r>
+        <w:t xml:space="preserve"> is great, but I want to know what my cost is before providing my info. </w:t>
+      </w:r>
+    </w:p>
+    <w:p>
+      <w:r>
+        <w:t xml:space="preserve">UST-03: </w:t>
+      </w:r>
+      <w:r>
+        <w:t xml:space="preserve">As a new customer, I want an easy </w:t>
+      </w:r>
+      <w:r>
+        <w:t>sign-up</w:t>
+      </w:r>
+      <w:r>
+        <w:t xml:space="preserve"> that includes my info with boat information. I want a single signup and reservation page. </w:t>
+      </w:r>
+    </w:p>
+    <w:p>
+      <w:r>
+        <w:t xml:space="preserve">UST-04: </w:t>
+      </w:r>
+      <w:r>
+        <w:t xml:space="preserve">As a customer looking to sign up and want an easy-to-follow email verification. I want to be sure that my info is secure and have channels to inform me if something fish happened to my account. </w:t>
+      </w:r>
+    </w:p>
+    <w:p>
+      <w:r>
         <w:t>UST-0</w:t>
       </w:r>
       <w:r>
-        <w:t>2</w:t>
+        <w:t>5</w:t>
       </w:r>
       <w:r>
         <w:t xml:space="preserve">: </w:t>
       </w:r>
       <w:r>
-        <w:t xml:space="preserve">As a possible new </w:t>
-      </w:r>
-      <w:r>
-        <w:t>customer,</w:t>
-      </w:r>
-      <w:r>
-        <w:t xml:space="preserve"> I want information on the slip pricing formula, a general 10/ft + 10 </w:t>
-      </w:r>
-      <w:r>
-        <w:t>Elec</w:t>
-      </w:r>
-      <w:r>
-        <w:t xml:space="preserve"> is great, but I want to know what my cost is before providing my info. </w:t>
+        <w:t xml:space="preserve">As a customer whose boat slip sizes are not available </w:t>
+      </w:r>
+      <w:proofErr w:type="gramStart"/>
+      <w:r>
+        <w:t>at the moment</w:t>
+      </w:r>
+      <w:proofErr w:type="gramEnd"/>
+      <w:r>
+        <w:t xml:space="preserve">, I want to be informed that these slips are not </w:t>
+      </w:r>
+      <w:r>
+        <w:t>available and</w:t>
+      </w:r>
+      <w:r>
+        <w:t xml:space="preserve"> have a clear path to </w:t>
+      </w:r>
+      <w:r>
+        <w:t>sign up</w:t>
+      </w:r>
+      <w:r>
+        <w:t xml:space="preserve"> for the waitlist. </w:t>
       </w:r>
     </w:p>
     <w:p>
@@ -146,19 +196,30 @@
         <w:t>UST-0</w:t>
       </w:r>
       <w:r>
-        <w:t>3</w:t>
+        <w:t>6</w:t>
       </w:r>
       <w:r>
         <w:t xml:space="preserve">: </w:t>
       </w:r>
       <w:r>
-        <w:t xml:space="preserve">As a new customer, I want an easy </w:t>
-      </w:r>
-      <w:r>
-        <w:t>sign-up</w:t>
-      </w:r>
-      <w:r>
-        <w:t xml:space="preserve"> that includes my info with boat information. I want a single signup and reservation page. </w:t>
+        <w:t xml:space="preserve">As a customer </w:t>
+      </w:r>
+      <w:proofErr w:type="gramStart"/>
+      <w:r>
+        <w:t>who’s</w:t>
+      </w:r>
+      <w:proofErr w:type="gramEnd"/>
+      <w:r>
+        <w:t xml:space="preserve"> </w:t>
+      </w:r>
+      <w:r>
+        <w:t>size slip is not available</w:t>
+      </w:r>
+      <w:r>
+        <w:t xml:space="preserve">, I want to know how many people are ahead of me so I can decide whether to join the </w:t>
+      </w:r>
+      <w:r>
+        <w:t>waitlist.</w:t>
       </w:r>
     </w:p>
     <w:p>
@@ -166,180 +227,45 @@
         <w:t>UST-0</w:t>
       </w:r>
       <w:r>
-        <w:t>4</w:t>
+        <w:t>7</w:t>
       </w:r>
       <w:r>
         <w:t xml:space="preserve">: </w:t>
       </w:r>
       <w:r>
-        <w:t xml:space="preserve">As a customer looking to sign up and want an easy-to-follow email verification. I want to be sure that my info is secure and have channels to inform me if something fish happened to my account. </w:t>
-      </w:r>
-    </w:p>
-    <w:p>
-      <w:r>
-        <w:t>UST-0</w:t>
-      </w:r>
-      <w:r>
-        <w:t>5</w:t>
+        <w:t xml:space="preserve">As I signed </w:t>
+      </w:r>
+      <w:r>
+        <w:t xml:space="preserve">up </w:t>
+      </w:r>
+      <w:r>
+        <w:t xml:space="preserve">client, I want a detailed </w:t>
+      </w:r>
+      <w:r>
+        <w:t>summary</w:t>
+      </w:r>
+      <w:r>
+        <w:t xml:space="preserve"> of my reservation. This should include my boat info, slip size, slip number, check-in date and total cost for the time reserved. </w:t>
+      </w:r>
+    </w:p>
+    <w:p>
+      <w:r>
+        <w:t>UST-</w:t>
+      </w:r>
+      <w:r>
+        <w:t>08</w:t>
       </w:r>
       <w:r>
         <w:t xml:space="preserve">: </w:t>
       </w:r>
       <w:r>
-        <w:t xml:space="preserve">As a registered client I want to be able to login, view the </w:t>
-      </w:r>
-      <w:proofErr w:type="gramStart"/>
-      <w:r>
-        <w:t>site</w:t>
-      </w:r>
-      <w:proofErr w:type="gramEnd"/>
-      <w:r>
-        <w:t xml:space="preserve"> and reserve my slip without annoying re-authentication. </w:t>
-      </w:r>
-    </w:p>
-    <w:p>
-      <w:r>
-        <w:t>UST-0</w:t>
-      </w:r>
-      <w:r>
-        <w:t>6</w:t>
-      </w:r>
-      <w:r>
-        <w:t xml:space="preserve">: </w:t>
-      </w:r>
-      <w:r>
-        <w:t xml:space="preserve">As a user that signed </w:t>
-      </w:r>
-      <w:r>
-        <w:t>in,</w:t>
-      </w:r>
-      <w:r>
-        <w:t xml:space="preserve"> I want to see only the slip information that fits my boat. I </w:t>
-      </w:r>
-      <w:proofErr w:type="gramStart"/>
-      <w:r>
-        <w:t>don’t</w:t>
-      </w:r>
-      <w:proofErr w:type="gramEnd"/>
-      <w:r>
-        <w:t xml:space="preserve"> want information about sizes that </w:t>
-      </w:r>
-      <w:proofErr w:type="gramStart"/>
-      <w:r>
-        <w:t>don’t</w:t>
-      </w:r>
-      <w:proofErr w:type="gramEnd"/>
-      <w:r>
-        <w:t xml:space="preserve"> suit my needs. </w:t>
-      </w:r>
-    </w:p>
-    <w:p>
-      <w:r>
-        <w:t>UST-0</w:t>
-      </w:r>
-      <w:r>
-        <w:t>7</w:t>
-      </w:r>
-      <w:r>
-        <w:t xml:space="preserve">: </w:t>
-      </w:r>
-      <w:r>
-        <w:t xml:space="preserve">As a customer whose boat slip sizes are not available </w:t>
-      </w:r>
-      <w:proofErr w:type="gramStart"/>
-      <w:r>
-        <w:t>at the moment</w:t>
-      </w:r>
-      <w:proofErr w:type="gramEnd"/>
-      <w:r>
-        <w:t xml:space="preserve">, I want to </w:t>
-      </w:r>
-      <w:proofErr w:type="gramStart"/>
-      <w:r>
-        <w:t>be informed</w:t>
-      </w:r>
-      <w:proofErr w:type="gramEnd"/>
-      <w:r>
-        <w:t xml:space="preserve"> that these slips are not </w:t>
-      </w:r>
-      <w:r>
-        <w:t>available and</w:t>
-      </w:r>
-      <w:r>
-        <w:t xml:space="preserve"> have a clear path to </w:t>
-      </w:r>
-      <w:r>
-        <w:t>sign up</w:t>
-      </w:r>
-      <w:r>
-        <w:t xml:space="preserve"> for the waitlist. </w:t>
-      </w:r>
-    </w:p>
-    <w:p>
-      <w:r>
-        <w:t>UST-0</w:t>
-      </w:r>
-      <w:r>
-        <w:t>8</w:t>
-      </w:r>
-      <w:r>
-        <w:t xml:space="preserve">: </w:t>
-      </w:r>
-      <w:r>
-        <w:t xml:space="preserve">As a customer </w:t>
-      </w:r>
-      <w:proofErr w:type="gramStart"/>
-      <w:r>
-        <w:t>who’s</w:t>
-      </w:r>
-      <w:proofErr w:type="gramEnd"/>
-      <w:r>
-        <w:t xml:space="preserve"> on slip is not, I want to know how </w:t>
-      </w:r>
-      <w:proofErr w:type="gramStart"/>
-      <w:r>
-        <w:t>many</w:t>
-      </w:r>
-      <w:proofErr w:type="gramEnd"/>
-      <w:r>
-        <w:t xml:space="preserve"> people are ahead of me so I can decide whether to join the </w:t>
-      </w:r>
-      <w:r>
-        <w:t>waitlist.</w:t>
-      </w:r>
-    </w:p>
-    <w:p>
-      <w:r>
-        <w:t>UST-0</w:t>
-      </w:r>
-      <w:r>
-        <w:t>9</w:t>
-      </w:r>
-      <w:r>
-        <w:t xml:space="preserve">: </w:t>
-      </w:r>
-      <w:r>
-        <w:t xml:space="preserve">As I signed </w:t>
-      </w:r>
-      <w:r>
-        <w:t>up with a</w:t>
-      </w:r>
-      <w:r>
-        <w:t xml:space="preserve"> client, I want a detailed </w:t>
-      </w:r>
-      <w:r>
-        <w:t>summary</w:t>
-      </w:r>
-      <w:r>
-        <w:t xml:space="preserve"> of my reservation. This should include my boat info, slip size, slip number, check-in </w:t>
-      </w:r>
-      <w:proofErr w:type="gramStart"/>
-      <w:r>
-        <w:t>date</w:t>
-      </w:r>
-      <w:proofErr w:type="gramEnd"/>
-      <w:r>
-        <w:t xml:space="preserve"> and total cost for the time reserved. </w:t>
+        <w:t xml:space="preserve">As a returning customer, let me see my reservation ID along with all information about times I had reserved in the past. This should include </w:t>
+      </w:r>
+      <w:r>
+        <w:t>checking</w:t>
+      </w:r>
+      <w:r>
+        <w:t xml:space="preserve"> in dates and slips I used so I can log my details. </w:t>
       </w:r>
     </w:p>
     <w:p>
@@ -347,80 +273,26 @@
         <w:t>UST-</w:t>
       </w:r>
       <w:r>
-        <w:t>10</w:t>
-      </w:r>
-      <w:r>
-        <w:t xml:space="preserve">: </w:t>
-      </w:r>
-      <w:r>
-        <w:t xml:space="preserve">As a returning customer, let me see my reservation ID along with all information about times I had reserved in the past. This should include </w:t>
-      </w:r>
-      <w:r>
-        <w:t>checking</w:t>
-      </w:r>
-      <w:r>
-        <w:t xml:space="preserve"> in dates and slips I used so I can log my details. </w:t>
-      </w:r>
-    </w:p>
-    <w:p>
-      <w:r>
-        <w:t xml:space="preserve">UST-11: As a privacy focused person, I want my name to not </w:t>
-      </w:r>
-      <w:proofErr w:type="gramStart"/>
-      <w:r>
-        <w:t>be disclosed</w:t>
-      </w:r>
-      <w:proofErr w:type="gramEnd"/>
-      <w:r>
-        <w:t xml:space="preserve"> on the waitlist. </w:t>
-      </w:r>
-    </w:p>
-    <w:p>
-      <w:r>
-        <w:t xml:space="preserve">UST-12: As a privacy focused person, I want to know that my password </w:t>
-      </w:r>
-      <w:proofErr w:type="gramStart"/>
-      <w:r>
-        <w:t>is stored</w:t>
-      </w:r>
-      <w:proofErr w:type="gramEnd"/>
-      <w:r>
-        <w:t xml:space="preserve"> hashed and all personal info to </w:t>
-      </w:r>
-      <w:proofErr w:type="gramStart"/>
-      <w:r>
-        <w:t>be protected</w:t>
-      </w:r>
-      <w:proofErr w:type="gramEnd"/>
-      <w:r>
-        <w:t xml:space="preserve">. </w:t>
-      </w:r>
-    </w:p>
-    <w:p>
-      <w:r>
-        <w:lastRenderedPageBreak/>
-        <w:t xml:space="preserve">UST-13: As an active customer, I want to have the ability to cancel my reservation from the summery page. I then want to </w:t>
-      </w:r>
-      <w:proofErr w:type="gramStart"/>
-      <w:r>
-        <w:t>be returned</w:t>
-      </w:r>
-      <w:proofErr w:type="gramEnd"/>
-      <w:r>
-        <w:t xml:space="preserve"> to the reservation page where I can make a new reservation without it affecting my log information. </w:t>
+        <w:t>09</w:t>
+      </w:r>
+      <w:r>
+        <w:t xml:space="preserve">: As a </w:t>
+      </w:r>
+      <w:r>
+        <w:t xml:space="preserve">returning </w:t>
+      </w:r>
+      <w:r>
+        <w:t xml:space="preserve">customer, I want to have the ability to cancel my reservation from the summery page. I then want to be returned to the reservation page where I can make a new reservation without it affecting my log information. </w:t>
       </w:r>
     </w:p>
     <w:p/>
     <w:p/>
+    <w:p>
+      <w:r>
+        <w:t>Users:</w:t>
+      </w:r>
+    </w:p>
     <w:p/>
-    <w:p/>
-    <w:p/>
-    <w:p/>
-    <w:p>
-      <w:r>
-        <w:t xml:space="preserve">Users: </w:t>
-      </w:r>
-    </w:p>
     <w:p>
       <w:pPr>
         <w:pStyle w:val="ListParagraph"/>
@@ -430,212 +302,7 @@
         </w:numPr>
       </w:pPr>
       <w:r>
-        <w:t xml:space="preserve">Dan Novak </w:t>
-      </w:r>
-    </w:p>
-    <w:p>
-      <w:pPr>
-        <w:pStyle w:val="ListParagraph"/>
-        <w:numPr>
-          <w:ilvl w:val="1"/>
-          <w:numId w:val="1"/>
-        </w:numPr>
-      </w:pPr>
-      <w:r>
-        <w:t>58-Year-old</w:t>
-      </w:r>
-      <w:r>
-        <w:t xml:space="preserve"> Contractor </w:t>
-      </w:r>
-      <w:proofErr w:type="gramStart"/>
-      <w:r>
-        <w:t>that’s</w:t>
-      </w:r>
-      <w:proofErr w:type="gramEnd"/>
-      <w:r>
-        <w:t xml:space="preserve"> almost retired </w:t>
-      </w:r>
-    </w:p>
-    <w:p>
-      <w:pPr>
-        <w:pStyle w:val="ListParagraph"/>
-        <w:numPr>
-          <w:ilvl w:val="1"/>
-          <w:numId w:val="1"/>
-        </w:numPr>
-      </w:pPr>
-      <w:r>
-        <w:t xml:space="preserve">Has 34 ft Cruiser </w:t>
-      </w:r>
-    </w:p>
-    <w:p>
-      <w:pPr>
-        <w:pStyle w:val="ListParagraph"/>
-        <w:numPr>
-          <w:ilvl w:val="1"/>
-          <w:numId w:val="1"/>
-        </w:numPr>
-      </w:pPr>
-      <w:r>
-        <w:rPr>
-          <w:noProof/>
-        </w:rPr>
-        <w:drawing>
-          <wp:inline distT="0" distB="0" distL="0" distR="0" wp14:anchorId="79AA89BF" wp14:editId="35F7039D">
-            <wp:extent cx="2803758" cy="2103120"/>
-            <wp:effectExtent l="0" t="0" r="0" b="0"/>
-            <wp:docPr id="1592427310" name="Picture 1"/>
-            <wp:cNvGraphicFramePr>
-              <a:graphicFrameLocks xmlns:a="http://schemas.openxmlformats.org/drawingml/2006/main" noChangeAspect="1"/>
-            </wp:cNvGraphicFramePr>
-            <a:graphic xmlns:a="http://schemas.openxmlformats.org/drawingml/2006/main">
-              <a:graphicData uri="http://schemas.openxmlformats.org/drawingml/2006/picture">
-                <pic:pic xmlns:pic="http://schemas.openxmlformats.org/drawingml/2006/picture">
-                  <pic:nvPicPr>
-                    <pic:cNvPr id="1592427310" name="Picture 1592427310"/>
-                    <pic:cNvPicPr/>
-                  </pic:nvPicPr>
-                  <pic:blipFill>
-                    <a:blip r:embed="rId5" cstate="print">
-                      <a:extLst>
-                        <a:ext uri="{28A0092B-C50C-407E-A947-70E740481C1C}">
-                          <a14:useLocalDpi xmlns:a14="http://schemas.microsoft.com/office/drawing/2010/main" val="0"/>
-                        </a:ext>
-                      </a:extLst>
-                    </a:blip>
-                    <a:stretch>
-                      <a:fillRect/>
-                    </a:stretch>
-                  </pic:blipFill>
-                  <pic:spPr>
-                    <a:xfrm>
-                      <a:off x="0" y="0"/>
-                      <a:ext cx="2803758" cy="2103120"/>
-                    </a:xfrm>
-                    <a:prstGeom prst="rect">
-                      <a:avLst/>
-                    </a:prstGeom>
-                  </pic:spPr>
-                </pic:pic>
-              </a:graphicData>
-            </a:graphic>
-          </wp:inline>
-        </w:drawing>
-      </w:r>
-    </w:p>
-    <w:p/>
-    <w:p>
-      <w:pPr>
-        <w:pStyle w:val="ListParagraph"/>
-        <w:numPr>
-          <w:ilvl w:val="0"/>
-          <w:numId w:val="1"/>
-        </w:numPr>
-      </w:pPr>
-      <w:r>
-        <w:t xml:space="preserve">John Larson </w:t>
-      </w:r>
-    </w:p>
-    <w:p>
-      <w:pPr>
-        <w:pStyle w:val="ListParagraph"/>
-        <w:numPr>
-          <w:ilvl w:val="1"/>
-          <w:numId w:val="1"/>
-        </w:numPr>
-      </w:pPr>
-      <w:r>
-        <w:t>45-year-old</w:t>
-      </w:r>
-      <w:r>
-        <w:t xml:space="preserve"> Fishery Consultant </w:t>
-      </w:r>
-    </w:p>
-    <w:p>
-      <w:pPr>
-        <w:pStyle w:val="ListParagraph"/>
-        <w:numPr>
-          <w:ilvl w:val="1"/>
-          <w:numId w:val="1"/>
-        </w:numPr>
-      </w:pPr>
-      <w:r>
-        <w:t xml:space="preserve">39 ft workboat </w:t>
-      </w:r>
-    </w:p>
-    <w:p>
-      <w:pPr>
-        <w:pStyle w:val="ListParagraph"/>
-        <w:ind w:left="1440"/>
-      </w:pPr>
-      <w:r>
-        <w:rPr>
-          <w:noProof/>
-        </w:rPr>
-        <w:drawing>
-          <wp:inline distT="0" distB="0" distL="0" distR="0" wp14:anchorId="2C562BD5" wp14:editId="473E23FA">
-            <wp:extent cx="2923300" cy="1645920"/>
-            <wp:effectExtent l="0" t="0" r="0" b="0"/>
-            <wp:docPr id="938937002" name="Picture 2"/>
-            <wp:cNvGraphicFramePr>
-              <a:graphicFrameLocks xmlns:a="http://schemas.openxmlformats.org/drawingml/2006/main" noChangeAspect="1"/>
-            </wp:cNvGraphicFramePr>
-            <a:graphic xmlns:a="http://schemas.openxmlformats.org/drawingml/2006/main">
-              <a:graphicData uri="http://schemas.openxmlformats.org/drawingml/2006/picture">
-                <pic:pic xmlns:pic="http://schemas.openxmlformats.org/drawingml/2006/picture">
-                  <pic:nvPicPr>
-                    <pic:cNvPr id="938937002" name="Picture 938937002"/>
-                    <pic:cNvPicPr/>
-                  </pic:nvPicPr>
-                  <pic:blipFill>
-                    <a:blip r:embed="rId6" cstate="print">
-                      <a:extLst>
-                        <a:ext uri="{28A0092B-C50C-407E-A947-70E740481C1C}">
-                          <a14:useLocalDpi xmlns:a14="http://schemas.microsoft.com/office/drawing/2010/main" val="0"/>
-                        </a:ext>
-                      </a:extLst>
-                    </a:blip>
-                    <a:stretch>
-                      <a:fillRect/>
-                    </a:stretch>
-                  </pic:blipFill>
-                  <pic:spPr>
-                    <a:xfrm>
-                      <a:off x="0" y="0"/>
-                      <a:ext cx="2923300" cy="1645920"/>
-                    </a:xfrm>
-                    <a:prstGeom prst="rect">
-                      <a:avLst/>
-                    </a:prstGeom>
-                  </pic:spPr>
-                </pic:pic>
-              </a:graphicData>
-            </a:graphic>
-          </wp:inline>
-        </w:drawing>
-      </w:r>
-    </w:p>
-    <w:p>
-      <w:pPr>
-        <w:pStyle w:val="ListParagraph"/>
-        <w:ind w:left="1440"/>
-      </w:pPr>
-    </w:p>
-    <w:p>
-      <w:pPr>
-        <w:pStyle w:val="ListParagraph"/>
-        <w:ind w:left="1440"/>
-      </w:pPr>
-    </w:p>
-    <w:p>
-      <w:pPr>
-        <w:pStyle w:val="ListParagraph"/>
-        <w:numPr>
-          <w:ilvl w:val="0"/>
-          <w:numId w:val="1"/>
-        </w:numPr>
-      </w:pPr>
-      <w:r>
+        <w:lastRenderedPageBreak/>
         <w:t>Henry Morrison</w:t>
       </w:r>
     </w:p>
@@ -691,7 +358,7 @@
                     <pic:cNvPicPr/>
                   </pic:nvPicPr>
                   <pic:blipFill>
-                    <a:blip r:embed="rId7" cstate="print">
+                    <a:blip r:embed="rId5" cstate="print">
                       <a:extLst>
                         <a:ext uri="{28A0092B-C50C-407E-A947-70E740481C1C}">
                           <a14:useLocalDpi xmlns:a14="http://schemas.microsoft.com/office/drawing/2010/main" val="0"/>
@@ -794,7 +461,7 @@
                     <pic:cNvPicPr/>
                   </pic:nvPicPr>
                   <pic:blipFill>
-                    <a:blip r:embed="rId8" cstate="print">
+                    <a:blip r:embed="rId6" cstate="print">
                       <a:extLst>
                         <a:ext uri="{28A0092B-C50C-407E-A947-70E740481C1C}">
                           <a14:useLocalDpi xmlns:a14="http://schemas.microsoft.com/office/drawing/2010/main" val="0"/>
@@ -823,18 +490,6 @@
     </w:p>
     <w:p>
       <w:pPr>
-        <w:pStyle w:val="ListParagraph"/>
-        <w:ind w:left="1440"/>
-      </w:pPr>
-    </w:p>
-    <w:p>
-      <w:pPr>
-        <w:pStyle w:val="ListParagraph"/>
-        <w:ind w:left="1440"/>
-      </w:pPr>
-    </w:p>
-    <w:p>
-      <w:pPr>
         <w:ind w:left="360"/>
       </w:pPr>
     </w:p>
@@ -886,10 +541,9 @@
         <w:rPr>
           <w:noProof/>
         </w:rPr>
-        <w:lastRenderedPageBreak/>
         <w:drawing>
-          <wp:inline distT="0" distB="0" distL="0" distR="0" wp14:anchorId="17E95735" wp14:editId="6D3981B2">
-            <wp:extent cx="3587221" cy="2011680"/>
+          <wp:inline distT="0" distB="0" distL="0" distR="0" wp14:anchorId="17E95735" wp14:editId="0B03D7BF">
+            <wp:extent cx="2935000" cy="1645920"/>
             <wp:effectExtent l="0" t="0" r="0" b="0"/>
             <wp:docPr id="1705152844" name="Picture 5"/>
             <wp:cNvGraphicFramePr>
@@ -903,7 +557,7 @@
                     <pic:cNvPicPr/>
                   </pic:nvPicPr>
                   <pic:blipFill>
-                    <a:blip r:embed="rId9" cstate="print">
+                    <a:blip r:embed="rId7" cstate="print">
                       <a:extLst>
                         <a:ext uri="{28A0092B-C50C-407E-A947-70E740481C1C}">
                           <a14:useLocalDpi xmlns:a14="http://schemas.microsoft.com/office/drawing/2010/main" val="0"/>
@@ -917,7 +571,7 @@
                   <pic:spPr>
                     <a:xfrm>
                       <a:off x="0" y="0"/>
-                      <a:ext cx="3587221" cy="2011680"/>
+                      <a:ext cx="2935000" cy="1645920"/>
                     </a:xfrm>
                     <a:prstGeom prst="rect">
                       <a:avLst/>

</xml_diff>